<commit_message>
chore: 删除遗留文件 oled_extras.c / misc.c/.h（无引用未编译）
Co-Authored-By: Claude Fable 5 <noreply@anthropic.com>
</commit_message>
<xml_diff>
--- a/Document/综合实训任务选题20240802 - 副本.docx
+++ b/Document/综合实训任务选题20240802 - 副本.docx
@@ -42,27 +42,6 @@
     </w:p>
     <w:p>
       <w:pPr>
-        <w:spacing w:line="360" w:lineRule="auto"/>
-        <w:jc w:val="center"/>
-        <w:rPr>
-          <w:b/>
-          <w:sz w:val="36"/>
-          <w:szCs w:val="36"/>
-        </w:rPr>
-      </w:pPr>
-      <w:r>
-        <w:rPr>
-          <w:rFonts w:hint="eastAsia"/>
-          <w:b/>
-          <w:color w:val="3366FF"/>
-          <w:sz w:val="36"/>
-          <w:szCs w:val="36"/>
-        </w:rPr>
-        <w:t>（小二，宋体加粗，居中）</w:t>
-      </w:r>
-    </w:p>
-    <w:p>
-      <w:pPr>
         <w:spacing w:beforeLines="100" w:before="312" w:line="360" w:lineRule="auto"/>
         <w:jc w:val="center"/>
         <w:rPr>
@@ -132,28 +111,6 @@
           <w:szCs w:val="48"/>
         </w:rPr>
         <w:t>系统设计</w:t>
-      </w:r>
-    </w:p>
-    <w:p>
-      <w:pPr>
-        <w:spacing w:beforeLines="100" w:before="312" w:line="360" w:lineRule="auto"/>
-        <w:jc w:val="center"/>
-        <w:rPr>
-          <w:b/>
-          <w:color w:val="3366FF"/>
-          <w:sz w:val="48"/>
-          <w:szCs w:val="48"/>
-        </w:rPr>
-      </w:pPr>
-      <w:r>
-        <w:rPr>
-          <w:rFonts w:hint="eastAsia"/>
-          <w:b/>
-          <w:color w:val="3366FF"/>
-          <w:sz w:val="36"/>
-          <w:szCs w:val="36"/>
-        </w:rPr>
-        <w:t>（小一，宋体加粗，居中）</w:t>
       </w:r>
     </w:p>
     <w:p>
@@ -319,7 +276,7 @@
           <w:numId w:val="12"/>
         </w:numPr>
         <w:rPr>
-          <w:rFonts w:ascii="宋体" w:hAnsi="宋体"/>
+          <w:rFonts w:ascii="宋体" w:hAnsi="宋体" w:hint="eastAsia"/>
           <w:bCs/>
         </w:rPr>
       </w:pPr>
@@ -386,15 +343,7 @@
           <w:rFonts w:ascii="宋体" w:hAnsi="宋体" w:hint="eastAsia"/>
           <w:bCs/>
         </w:rPr>
-        <w:t>编写 SSD1306 硬件 I2C 底层驱动（STC8H I2C 模块、MSSPEED 速率调优、初始化序列、</w:t>
-      </w:r>
-      <w:r>
-        <w:rPr>
-          <w:rFonts w:ascii="宋体" w:hAnsi="宋体" w:hint="eastAsia"/>
-          <w:bCs/>
-        </w:rPr>
-        <w:lastRenderedPageBreak/>
-        <w:t>双后端：实体 I2C / 虚拟 USB-CDC）与 1KB framebuffer，实现列级 diff 局部刷新引擎 + 周期全刷自愈 + 总线自动恢复。</w:t>
+        <w:t>编写 SSD1306 硬件 I2C 底层驱动（STC8H I2C 模块、MSSPEED 速率调优、初始化序列、双后端：实体 I2C / 虚拟 USB-CDC）与 1KB framebuffer，实现列级 diff 局部刷新引擎 + 周期全刷自愈 + 总线自动恢复。</w:t>
       </w:r>
     </w:p>
     <w:p>
@@ -413,7 +362,15 @@
           <w:rFonts w:ascii="宋体" w:hAnsi="宋体" w:hint="eastAsia"/>
           <w:bCs/>
         </w:rPr>
-        <w:t>移植开源 OLED_UI 框架：完成 C99→C51 兼容性改造（39 处），适配磁贴桌面、多级列表菜单、窗口组件、动画系统（UNLINEAR 插值）、渐隐效果、深浅色主题与中英文字模（裁剪 70KB→56KB、补 29 字、手绘 5 个功能图标）。</w:t>
+        <w:t>移植开源 OLED_UI 框架：完成 C99→C51 兼容性改造（39 处），适配磁贴桌面、多级列表菜单、窗口组件、动画系统（UNLINEAR 插值）、渐隐效果、深浅色主题与中英文字模（裁</w:t>
+      </w:r>
+      <w:r>
+        <w:rPr>
+          <w:rFonts w:ascii="宋体" w:hAnsi="宋体" w:hint="eastAsia"/>
+          <w:bCs/>
+        </w:rPr>
+        <w:lastRenderedPageBreak/>
+        <w:t>剪 70KB→56KB、补 29 字、手绘 5 个功能图标）。</w:t>
       </w:r>
     </w:p>
     <w:p>
@@ -499,7 +456,7 @@
           <w:numId w:val="15"/>
         </w:numPr>
         <w:rPr>
-          <w:rFonts w:ascii="宋体" w:hAnsi="宋体"/>
+          <w:rFonts w:ascii="宋体" w:hAnsi="宋体" w:hint="eastAsia"/>
           <w:bCs/>
         </w:rPr>
       </w:pPr>
@@ -598,7 +555,7 @@
           <w:numId w:val="17"/>
         </w:numPr>
         <w:rPr>
-          <w:rFonts w:ascii="宋体" w:hAnsi="宋体"/>
+          <w:rFonts w:ascii="宋体" w:hAnsi="宋体" w:hint="eastAsia"/>
           <w:bCs/>
         </w:rPr>
       </w:pPr>
@@ -1085,15 +1042,7 @@
           <w:rFonts w:ascii="宋体" w:hAnsi="宋体" w:hint="eastAsia"/>
           <w:bCs/>
         </w:rPr>
-        <w:t xml:space="preserve">软件成果：完整 Keil C51 工程源码（应用页层 / UI 框架层 / 驱动层 / 平台适配层分层架构，约 4.6 万字节代码 + 1.5 万字节字模），编译 0 Error / 6 Warning，烧录（IRC </w:t>
-      </w:r>
-      <w:r>
-        <w:rPr>
-          <w:rFonts w:ascii="宋体" w:hAnsi="宋体" w:hint="eastAsia"/>
-          <w:bCs/>
-        </w:rPr>
-        <w:lastRenderedPageBreak/>
-        <w:t>24.000MHz）后稳定运行。</w:t>
+        <w:t>软件成果：完整 Keil C51 工程源码（应用页层 / UI 框架层 / 驱动层 / 平台适配层分层架构，约 4.6 万字节代码 + 1.5 万字节字模），编译 0 Error / 6 Warning，烧录（IRC 24.000MHz）后稳定运行。</w:t>
       </w:r>
     </w:p>
     <w:p>
@@ -1103,7 +1052,7 @@
           <w:numId w:val="16"/>
         </w:numPr>
         <w:rPr>
-          <w:rFonts w:ascii="宋体" w:hAnsi="宋体"/>
+          <w:rFonts w:ascii="宋体" w:hAnsi="宋体" w:hint="eastAsia"/>
           <w:bCs/>
         </w:rPr>
       </w:pPr>
@@ -1123,6 +1072,7 @@
         <w:rPr>
           <w:rFonts w:hint="eastAsia"/>
         </w:rPr>
+        <w:lastRenderedPageBreak/>
         <w:t>六、主要参考资料</w:t>
       </w:r>
     </w:p>
@@ -1733,23 +1683,7 @@
           <w:rFonts w:ascii="宋体" w:hAnsi="宋体" w:hint="eastAsia"/>
           <w:bCs/>
         </w:rPr>
-        <w:t>使用</w:t>
-      </w:r>
-      <w:proofErr w:type="spellStart"/>
-      <w:r>
-        <w:rPr>
-          <w:rFonts w:ascii="宋体" w:hAnsi="宋体" w:hint="eastAsia"/>
-          <w:bCs/>
-        </w:rPr>
-        <w:t>keil</w:t>
-      </w:r>
-      <w:proofErr w:type="spellEnd"/>
-      <w:r>
-        <w:rPr>
-          <w:rFonts w:ascii="宋体" w:hAnsi="宋体" w:hint="eastAsia"/>
-          <w:bCs/>
-        </w:rPr>
-        <w:t xml:space="preserve"> C软件编写程序； </w:t>
+        <w:t xml:space="preserve">使用keil C软件编写程序； </w:t>
       </w:r>
     </w:p>
     <w:p>
@@ -2037,23 +1971,7 @@
           <w:bCs/>
         </w:rPr>
         <w:lastRenderedPageBreak/>
-        <w:t>使用</w:t>
-      </w:r>
-      <w:proofErr w:type="spellStart"/>
-      <w:r>
-        <w:rPr>
-          <w:rFonts w:ascii="宋体" w:hAnsi="宋体" w:hint="eastAsia"/>
-          <w:bCs/>
-        </w:rPr>
-        <w:t>keil</w:t>
-      </w:r>
-      <w:proofErr w:type="spellEnd"/>
-      <w:r>
-        <w:rPr>
-          <w:rFonts w:ascii="宋体" w:hAnsi="宋体" w:hint="eastAsia"/>
-          <w:bCs/>
-        </w:rPr>
-        <w:t xml:space="preserve"> C软件编写程序； </w:t>
+        <w:t xml:space="preserve">使用keil C软件编写程序； </w:t>
       </w:r>
     </w:p>
     <w:p>

</xml_diff>